<commit_message>
Update CDISC Reference Guide v2.0 with v15 fixes and regulatory advice
- Documents v15 fixes: SUPPEG IDVARVAL bridge, RRSM/EGHRMN standard codes, EGMETHOD empty
- Added Section 7.3: Regulatory recommendation (Option B - keep FPD in EG)
- Includes SDRG justification text for CT2002 extensible codelist warnings
- Updated validation history through v15 (57 CT2002 + 7 structural = ~64 total)

Co-Authored-By: Claude Opus 4.6 <noreply@anthropic.com>
</commit_message>
<xml_diff>
--- a/CDISC_SEND_Reference_Guide.docx
+++ b/CDISC_SEND_Reference_Guide.docx
@@ -80,12 +80,14 @@
           <w:sz w:val="20"/>
           <w:szCs w:val="20"/>
         </w:rPr>
-        <w:t xml:space="preserve">Version 1.0 — March 22, 2026</w:t>
+        <w:t xml:space="preserve">Version 2.0 — March 22, 2026 (v15 — Final)</w:t>
       </w:r>
     </w:p>
-    <w:r>
-      <w:br w:type="page"/>
-    </w:r>
+    <w:p>
+      <w:r>
+        <w:br w:type="page"/>
+      </w:r>
+    </w:p>
     <w:p>
       <w:pPr>
         <w:pStyle w:val="Heading1"/>
@@ -218,9 +220,11 @@
         <w:t xml:space="preserve">The EG (ECG Test Results) domain is repurposed for field potential measurements. Standard ECG test codes do not cover MEA-derived endpoints, so custom extensible codes are used.</w:t>
       </w:r>
     </w:p>
-    <w:r>
-      <w:br w:type="page"/>
-    </w:r>
+    <w:p>
+      <w:r>
+        <w:br w:type="page"/>
+      </w:r>
+    </w:p>
     <w:p>
       <w:pPr>
         <w:pStyle w:val="Heading1"/>
@@ -918,9 +922,11 @@
         <w:t xml:space="preserve">ARMCD reflects the assigned treatment group. For PARALLEL: one arm per compound. For DOSE ESCALATION: all subjects in same arm.</w:t>
       </w:r>
     </w:p>
-    <w:r>
-      <w:br w:type="page"/>
-    </w:r>
+    <w:p>
+      <w:r>
+        <w:br w:type="page"/>
+      </w:r>
+    </w:p>
     <w:p>
       <w:pPr>
         <w:pStyle w:val="Heading1"/>
@@ -1713,9 +1719,11 @@
         <w:t xml:space="preserve">When EGMETHOD is set for these measurements, we use DERIVED because values are algorithmically extracted from raw waveforms, not directly measured by a standard ECG device. This is appropriate for all MEA-derived endpoints.</w:t>
       </w:r>
     </w:p>
-    <w:r>
-      <w:br w:type="page"/>
-    </w:r>
+    <w:p>
+      <w:r>
+        <w:br w:type="page"/>
+      </w:r>
+    </w:p>
     <w:p>
       <w:pPr>
         <w:pStyle w:val="Heading1"/>
@@ -3382,7 +3390,7 @@
                 <w:sz w:val="18"/>
                 <w:szCs w:val="18"/>
               </w:rPr>
-              <w:t xml:space="preserve">Field Potential Duration (analog of QT)</w:t>
+              <w:t xml:space="preserve">Field Potential Duration (analog of QT). Custom extensible code.</w:t>
             </w:r>
           </w:p>
         </w:tc>
@@ -3526,7 +3534,7 @@
                 <w:sz w:val="18"/>
                 <w:szCs w:val="18"/>
               </w:rPr>
-              <w:t xml:space="preserve">FPD corrected by Fridericia (analog of QTcF)</w:t>
+              <w:t xml:space="preserve">FPD corrected by Fridericia (analog of QTcF). Custom extensible.</w:t>
             </w:r>
           </w:p>
         </w:tc>
@@ -3555,7 +3563,7 @@
                 <w:sz w:val="17"/>
                 <w:szCs w:val="17"/>
               </w:rPr>
-              <w:t xml:space="preserve">BP</w:t>
+              <w:t xml:space="preserve">RRSM</w:t>
             </w:r>
           </w:p>
         </w:tc>
@@ -3582,7 +3590,7 @@
                 <w:sz w:val="18"/>
                 <w:szCs w:val="18"/>
               </w:rPr>
-              <w:t xml:space="preserve">Beat Period</w:t>
+              <w:t xml:space="preserve">RR Interval, Single Measurement</w:t>
             </w:r>
           </w:p>
         </w:tc>
@@ -3665,7 +3673,7 @@
                 <w:sz w:val="18"/>
                 <w:szCs w:val="18"/>
               </w:rPr>
-              <w:t xml:space="preserve">Inter-beat interval (analog of RR interval)</w:t>
+              <w:t xml:space="preserve">Inter-beat interval. NCI CT standard code (was BP).</w:t>
             </w:r>
           </w:p>
         </w:tc>
@@ -3695,7 +3703,7 @@
                 <w:sz w:val="17"/>
                 <w:szCs w:val="17"/>
               </w:rPr>
-              <w:t xml:space="preserve">INTVL</w:t>
+              <w:t xml:space="preserve">EGHRMN</w:t>
             </w:r>
           </w:p>
         </w:tc>
@@ -3723,7 +3731,7 @@
                 <w:sz w:val="18"/>
                 <w:szCs w:val="18"/>
               </w:rPr>
-              <w:t xml:space="preserve">Heart Rate</w:t>
+              <w:t xml:space="preserve">ECG Mean Heart Rate</w:t>
             </w:r>
           </w:p>
         </w:tc>
@@ -3809,7 +3817,7 @@
                 <w:sz w:val="18"/>
                 <w:szCs w:val="18"/>
               </w:rPr>
-              <w:t xml:space="preserve">Derived from Beat Period</w:t>
+              <w:t xml:space="preserve">Heart rate derived from Beat Period. NCI CT standard code.</w:t>
             </w:r>
           </w:p>
         </w:tc>
@@ -3948,7 +3956,7 @@
                 <w:sz w:val="18"/>
                 <w:szCs w:val="18"/>
               </w:rPr>
-              <w:t xml:space="preserve">Na+ channel depolarization spike amplitude</w:t>
+              <w:t xml:space="preserve">Na+ depolarization spike amplitude. Custom extensible code.</w:t>
             </w:r>
           </w:p>
         </w:tc>
@@ -4092,7 +4100,7 @@
                 <w:sz w:val="18"/>
                 <w:szCs w:val="18"/>
               </w:rPr>
-              <w:t xml:space="preserve">Short-term variability of corrected FPD</w:t>
+              <w:t xml:space="preserve">Short-term variability of corrected FPD. Custom extensible.</w:t>
             </w:r>
           </w:p>
         </w:tc>
@@ -4803,9 +4811,11 @@
         </w:tc>
       </w:tr>
     </w:tbl>
-    <w:r>
-      <w:br w:type="page"/>
-    </w:r>
+    <w:p>
+      <w:r>
+        <w:br w:type="page"/>
+      </w:r>
+    </w:p>
     <w:p>
       <w:pPr>
         <w:pStyle w:val="Heading1"/>
@@ -6015,9 +6025,11 @@
         <w:t xml:space="preserve">EG variable labels differ from the SDTM base model. Use labels from SENDIG v3.1.1, not SDTM. Example: EGORRES = 'Result or Findings as Collected' (not 'Result or Finding in Original Units').</w:t>
       </w:r>
     </w:p>
-    <w:r>
-      <w:br w:type="page"/>
-    </w:r>
+    <w:p>
+      <w:r>
+        <w:br w:type="page"/>
+      </w:r>
+    </w:p>
     <w:p>
       <w:pPr>
         <w:pStyle w:val="Heading1"/>
@@ -7282,9 +7294,11 @@
         </w:tc>
       </w:tr>
     </w:tbl>
-    <w:r>
-      <w:br w:type="page"/>
-    </w:r>
+    <w:p>
+      <w:r>
+        <w:br w:type="page"/>
+      </w:r>
+    </w:p>
     <w:p>
       <w:pPr>
         <w:pStyle w:val="Heading1"/>
@@ -7307,7 +7321,7 @@
           <w:sz w:val="20"/>
           <w:szCs w:val="20"/>
         </w:rPr>
-        <w:t xml:space="preserve">After 14 iterations of fix cycles, the export achieves 42 remaining Pinnacle 21 issues, all of which are expected and justified for an in vitro hiPSC-CM study. These must be documented in the Study Data Reviewer's Guide (SDRG) accompanying any FDA submission.</w:t>
+        <w:t xml:space="preserve">After 15 iterations of fix cycles, the export achieves zero structural or logical errors in Pinnacle 21. All remaining issues (~64) are expected terminology warnings for an in vitro hiPSC-CM study. These must be documented in the Study Data Reviewer's Guide (SDRG) accompanying any FDA submission.</w:t>
       </w:r>
     </w:p>
     <w:p>
@@ -7490,7 +7504,7 @@
                 <w:sz w:val="18"/>
                 <w:szCs w:val="18"/>
               </w:rPr>
-              <w:t xml:space="preserve">~1028 (extensible codelist)</w:t>
+              <w:t xml:space="preserve">~57 (extensible codelist)</w:t>
             </w:r>
           </w:p>
         </w:tc>
@@ -7517,7 +7531,7 @@
                 <w:sz w:val="18"/>
                 <w:szCs w:val="18"/>
               </w:rPr>
-              <w:t xml:space="preserve">Custom EGTESTCD/EGTEST for hiPSC-CM field potential endpoints. EGMETHOD=DERIVED because values are algorithmically extracted. These are extensions of the ECG codelist for in vitro electrophysiology.</w:t>
+              <w:t xml:space="preserve">Custom EGTESTCD/EGTEST for hiPSC-CM field potential endpoints: FPD, FPDcF, Spike Amplitude, STV of FPDcF. These are standard MEA terminology not yet in the CDISC ECG dictionary. Extensible codelist allows new terms by design.</w:t>
             </w:r>
           </w:p>
         </w:tc>
@@ -7691,94 +7705,6 @@
                 <w:szCs w:val="18"/>
               </w:rPr>
               <w:t xml:space="preserve">Variables structurally empty for in vitro: no age unit (no age), no unscheduled flag (all planned), no ECG confinement state/lead/position (MEA plate, not animal).</w:t>
-            </w:r>
-          </w:p>
-        </w:tc>
-      </w:tr>
-      <w:tr>
-        <w:tc>
-          <w:tcPr>
-            <w:tcW w:type="dxa" w:w="1300"/>
-            <w:tcBorders>
-              <w:top w:val="single" w:color="CCCCCC" w:sz="1"/>
-              <w:left w:val="single" w:color="CCCCCC" w:sz="1"/>
-              <w:bottom w:val="single" w:color="CCCCCC" w:sz="1"/>
-              <w:right w:val="single" w:color="CCCCCC" w:sz="1"/>
-            </w:tcBorders>
-            <w:shd w:fill="F2F7FB" w:val="clear"/>
-            <w:tcMar>
-              <w:top w:type="dxa" w:w="60"/>
-              <w:left w:type="dxa" w:w="100"/>
-              <w:bottom w:type="dxa" w:w="60"/>
-              <w:right w:type="dxa" w:w="100"/>
-            </w:tcMar>
-          </w:tcPr>
-          <w:p>
-            <w:r>
-              <w:rPr>
-                <w:rFonts w:ascii="Arial" w:cs="Arial" w:eastAsia="Arial" w:hAnsi="Arial"/>
-                <w:b/>
-                <w:bCs/>
-                <w:sz w:val="18"/>
-                <w:szCs w:val="18"/>
-              </w:rPr>
-              <w:t xml:space="preserve">CT2005</w:t>
-            </w:r>
-          </w:p>
-        </w:tc>
-        <w:tc>
-          <w:tcPr>
-            <w:tcW w:type="dxa" w:w="2200"/>
-            <w:tcBorders>
-              <w:top w:val="single" w:color="CCCCCC" w:sz="1"/>
-              <w:left w:val="single" w:color="CCCCCC" w:sz="1"/>
-              <w:bottom w:val="single" w:color="CCCCCC" w:sz="1"/>
-              <w:right w:val="single" w:color="CCCCCC" w:sz="1"/>
-            </w:tcBorders>
-            <w:shd w:fill="F2F7FB" w:val="clear"/>
-            <w:tcMar>
-              <w:top w:type="dxa" w:w="60"/>
-              <w:left w:type="dxa" w:w="100"/>
-              <w:bottom w:type="dxa" w:w="60"/>
-              <w:right w:type="dxa" w:w="100"/>
-            </w:tcMar>
-          </w:tcPr>
-          <w:p>
-            <w:r>
-              <w:rPr>
-                <w:rFonts w:ascii="Arial" w:cs="Arial" w:eastAsia="Arial" w:hAnsi="Arial"/>
-                <w:sz w:val="18"/>
-                <w:szCs w:val="18"/>
-              </w:rPr>
-              <w:t xml:space="preserve">1 (STRAIN)</w:t>
-            </w:r>
-          </w:p>
-        </w:tc>
-        <w:tc>
-          <w:tcPr>
-            <w:tcW w:type="dxa" w:w="5860"/>
-            <w:tcBorders>
-              <w:top w:val="single" w:color="CCCCCC" w:sz="1"/>
-              <w:left w:val="single" w:color="CCCCCC" w:sz="1"/>
-              <w:bottom w:val="single" w:color="CCCCCC" w:sz="1"/>
-              <w:right w:val="single" w:color="CCCCCC" w:sz="1"/>
-            </w:tcBorders>
-            <w:shd w:fill="F2F7FB" w:val="clear"/>
-            <w:tcMar>
-              <w:top w:type="dxa" w:w="60"/>
-              <w:left w:type="dxa" w:w="100"/>
-              <w:bottom w:type="dxa" w:w="60"/>
-              <w:right w:type="dxa" w:w="100"/>
-            </w:tcMar>
-          </w:tcPr>
-          <w:p>
-            <w:r>
-              <w:rPr>
-                <w:rFonts w:ascii="Arial" w:cs="Arial" w:eastAsia="Arial" w:hAnsi="Arial"/>
-                <w:sz w:val="18"/>
-                <w:szCs w:val="18"/>
-              </w:rPr>
-              <w:t xml:space="preserve">STRAIN left empty (NA) for HUMAN species; hiPSC-CM is not a strain in NCI CT terminology.</w:t>
             </w:r>
           </w:p>
         </w:tc>
@@ -7871,12 +7797,131 @@
           <w:sz w:val="20"/>
           <w:szCs w:val="20"/>
         </w:rPr>
-        <w:t xml:space="preserve">v14: EG/SUPPEG split, removed SCORE units, emptied STRAIN. Final: 42 issues (all accepted/documented).</w:t>
+        <w:t xml:space="preserve">v14: EG/SUPPEG split, removed SCORE units, emptied STRAIN. Reduced to 42 issues.</w:t>
       </w:r>
     </w:p>
-    <w:r>
-      <w:br w:type="page"/>
-    </w:r>
+    <w:p>
+      <w:pPr>
+        <w:spacing w:after="120"/>
+      </w:pPr>
+      <w:r>
+        <w:rPr>
+          <w:rFonts w:ascii="Arial" w:cs="Arial" w:eastAsia="Arial" w:hAnsi="Arial"/>
+          <w:sz w:val="20"/>
+          <w:szCs w:val="20"/>
+        </w:rPr>
+        <w:t xml:space="preserve">v15: Fixed SUPPEG IDVARVAL bridge to parent EG records. Mapped Beat Period to standard RRSM, Heart Rate to EGHRMN. Emptied EGMETHOD (DERIVED not in NCI CT). Final: ~64 issues, of which 57 are CT2002 extensible codelist warnings for custom MEA test codes, and 7 are structurally empty variables expected for in vitro.</w:t>
+      </w:r>
+    </w:p>
+    <w:p>
+      <w:pPr>
+        <w:pStyle w:val="Heading2"/>
+        <w:spacing w:after="150" w:before="300"/>
+      </w:pPr>
+      <w:r>
+        <w:rPr>
+          <w:rFonts w:ascii="Arial" w:cs="Arial" w:eastAsia="Arial" w:hAnsi="Arial"/>
+        </w:rPr>
+        <w:t xml:space="preserve">7.3 Regulatory Recommendation: FPD in EG (Option B)</w:t>
+      </w:r>
+    </w:p>
+    <w:p>
+      <w:pPr>
+        <w:spacing w:after="120"/>
+      </w:pPr>
+      <w:r>
+        <w:rPr>
+          <w:rFonts w:ascii="Arial" w:cs="Arial" w:eastAsia="Arial" w:hAnsi="Arial"/>
+          <w:sz w:val="20"/>
+          <w:szCs w:val="20"/>
+        </w:rPr>
+        <w:t xml:space="preserve">After achieving zero structural errors, 57 CT2002 warnings remain for custom test codes (FPD, FPDcF, Spike Amplitude, STV of FPDcF) in the EG domain. Two options were evaluated:</w:t>
+      </w:r>
+    </w:p>
+    <w:p>
+      <w:pPr>
+        <w:spacing w:after="120"/>
+      </w:pPr>
+      <w:r>
+        <w:rPr>
+          <w:rFonts w:ascii="Arial" w:cs="Arial" w:eastAsia="Arial" w:hAnsi="Arial"/>
+          <w:b/>
+          <w:bCs/>
+          <w:sz w:val="20"/>
+          <w:szCs w:val="20"/>
+        </w:rPr>
+        <w:t xml:space="preserve">Option A (Clean Report): </w:t>
+      </w:r>
+      <w:r>
+        <w:rPr>
+          <w:rFonts w:ascii="Arial" w:cs="Arial" w:eastAsia="Arial" w:hAnsi="Arial"/>
+          <w:sz w:val="20"/>
+          <w:szCs w:val="20"/>
+        </w:rPr>
+        <w:t xml:space="preserve">Move all custom tests to suppeg.xpt, leaving EG with only standard NCI CT codes (RRSM, EGHRMN). This eliminates all CT2002 warnings but hides the primary CiPA endpoint (FPD) in a supplemental domain.</w:t>
+      </w:r>
+    </w:p>
+    <w:p>
+      <w:pPr>
+        <w:spacing w:after="120"/>
+      </w:pPr>
+      <w:r>
+        <w:rPr>
+          <w:rFonts w:ascii="Arial" w:cs="Arial" w:eastAsia="Arial" w:hAnsi="Arial"/>
+          <w:b/>
+          <w:bCs/>
+          <w:sz w:val="20"/>
+          <w:szCs w:val="20"/>
+        </w:rPr>
+        <w:t xml:space="preserve">Option B (Recommended): </w:t>
+      </w:r>
+      <w:r>
+        <w:rPr>
+          <w:rFonts w:ascii="Arial" w:cs="Arial" w:eastAsia="Arial" w:hAnsi="Arial"/>
+          <w:sz w:val="20"/>
+          <w:szCs w:val="20"/>
+        </w:rPr>
+        <w:t xml:space="preserve">Keep FPD, FPDcF, and Spike Amplitude in eg.xpt as the primary findings. The CT2002 warnings are on an extensible codelist, meaning FDA explicitly allows new terms. Document the custom codes in the SDRG with the following justification:</w:t>
+      </w:r>
+    </w:p>
+    <w:p>
+      <w:pPr>
+        <w:pBdr>
+          <w:left w:val="single" w:color="2E75B6" w:sz="6" w:space="8"/>
+        </w:pBdr>
+        <w:spacing w:after="120" w:before="120"/>
+        <w:ind w:left="720" w:right="720"/>
+      </w:pPr>
+      <w:r>
+        <w:rPr>
+          <w:rFonts w:ascii="Arial" w:cs="Arial" w:eastAsia="Arial" w:hAnsi="Arial"/>
+          <w:i/>
+          <w:iCs/>
+          <w:color w:val="333333"/>
+          <w:sz w:val="19"/>
+          <w:szCs w:val="19"/>
+        </w:rPr>
+        <w:t xml:space="preserve">"CT2002 warnings in EG are expected and justified. The ECG Test Code and ECG Test Name codelists have been extended with FPD (Field Potential Duration), FPDcF (Fridericia-corrected FPD), Spike Amplitude, and STV of FPDcF, as these are the standard measurement endpoints for in vitro MEA (Multi-Electrode Array) assays on hiPSC-derived cardiomyocytes. No synonyms or duplicates of existing CDISC terms exist for these parameters. This is consistent with CiPA (Comprehensive in vitro Proarrhythmia Assay) framework terminology."</w:t>
+      </w:r>
+    </w:p>
+    <w:p>
+      <w:pPr>
+        <w:spacing w:after="120"/>
+      </w:pPr>
+      <w:r>
+        <w:rPr>
+          <w:rFonts w:ascii="Arial" w:cs="Arial" w:eastAsia="Arial" w:hAnsi="Arial"/>
+          <w:sz w:val="20"/>
+          <w:szCs w:val="20"/>
+        </w:rPr>
+        <w:t xml:space="preserve">Option B was selected because FPD is the primary endpoint of the CiPA safety assessment. Placing it in a supplemental domain would be semantically incorrect and could confuse FDA reviewers expecting to find primary findings data in the EG domain.</w:t>
+      </w:r>
+    </w:p>
+    <w:p>
+      <w:r>
+        <w:br w:type="page"/>
+      </w:r>
+    </w:p>
     <w:p>
       <w:pPr>
         <w:pStyle w:val="Heading1"/>
@@ -8955,7 +9000,7 @@
         <w:sz w:val="16"/>
         <w:szCs w:val="16"/>
       </w:rPr>
-      <w:t xml:space="preserve">	v1.0 — March 2026</w:t>
+      <w:t xml:space="preserve">	v2.0 — March 2026</w:t>
     </w:r>
   </w:p>
 </w:hdr>

</xml_diff>